<commit_message>
edited resume with leadership experience
</commit_message>
<xml_diff>
--- a/job_filter_agent/rohit-nimmakuri-resume.docx
+++ b/job_filter_agent/rohit-nimmakuri-resume.docx
@@ -31,7 +31,7 @@
         </w:rPr>
         <w:t xml:space="preserve">216-712-2292  •  </w:t>
       </w:r>
-      <w:hyperlink w:history="1" r:id="rIdq1osa-pangx8uk_fqfczg">
+      <w:hyperlink w:history="1" r:id="rIdxdejlmfbhyupp7ocp9j7s">
         <w:r>
           <w:rPr>
             <w:rFonts w:ascii="Calibri" w:cs="Calibri" w:eastAsia="Calibri" w:hAnsi="Calibri"/>
@@ -59,7 +59,7 @@
         </w:rPr>
         <w:t xml:space="preserve">LinkedIn: </w:t>
       </w:r>
-      <w:hyperlink w:history="1" r:id="rIdjqd6zzrjuv-lo32spymlx">
+      <w:hyperlink w:history="1" r:id="rIdz_wt3hwt94lthkhso3cdy">
         <w:r>
           <w:rPr>
             <w:rFonts w:ascii="Calibri" w:cs="Calibri" w:eastAsia="Calibri" w:hAnsi="Calibri"/>
@@ -609,6 +609,24 @@
           <w:sz w:val="22"/>
           <w:szCs w:val="22"/>
         </w:rPr>
+        <w:t xml:space="preserve">Led a team of 7+ engineers on MCMR: assigned and reviewed their work, mentored them on the platform's PL/SQL and data-pipeline patterns, and was the direct point of contact with the client's stakeholders on delivery and status.</w:t>
+      </w:r>
+    </w:p>
+    <w:p>
+      <w:pPr>
+        <w:pStyle w:val="ListParagraph"/>
+        <w:numPr>
+          <w:ilvl w:val="0"/>
+          <w:numId w:val="2"/>
+        </w:numPr>
+        <w:spacing w:after="40"/>
+      </w:pPr>
+      <w:r>
+        <w:rPr>
+          <w:rFonts w:ascii="Calibri" w:cs="Calibri" w:eastAsia="Calibri" w:hAnsi="Calibri"/>
+          <w:sz w:val="22"/>
+          <w:szCs w:val="22"/>
+        </w:rPr>
         <w:t xml:space="preserve">Built an agentic AI assistant (Python, Claude API, JIRA REST API, GitHub API) on my own initiative. Give it a JIRA ticket number and it chains together several steps by itself: pulls the ticket via the JIRA API, reads the relevant part of the repo via the GitHub API, proposes code changes with reasoning, and once I approve, applies them and generates a full unit test document with scenarios and screenshots. Built it using GitHub Copilot to help write the Python.</w:t>
       </w:r>
     </w:p>
@@ -877,7 +895,7 @@
           <w:sz w:val="22"/>
           <w:szCs w:val="22"/>
         </w:rPr>
-        <w:t xml:space="preserve">Was the go-to for technical decisions on this project, did code reviews, and worked with an offshore team on day-to-day delivery.</w:t>
+        <w:t xml:space="preserve">Led a team of 7+ engineers on the platform: managed and mentored the team, assigned and reviewed their work, was the go-to for technical decisions and code reviews, and was the client-facing point of contact on delivery, working closely with an offshore team day to day.</w:t>
       </w:r>
     </w:p>
     <w:p>

</xml_diff>